<commit_message>
Started with Machine Learning Doc
</commit_message>
<xml_diff>
--- a/Machine Learning (ML)/Machine Learning Theory.docx
+++ b/Machine Learning (ML)/Machine Learning Theory.docx
@@ -1527,33 +1527,952 @@
           <w:lang w:val="en-IN"/>
         </w:rPr>
         <w:lastRenderedPageBreak/>
-        <w:br w:type="page"/>
-      </w:r>
-    </w:p>
-    <w:p>
-      <w:pPr>
-        <w:rPr>
-          <w:lang w:val="en-IN"/>
-        </w:rPr>
-      </w:pPr>
-    </w:p>
-    <w:p>
-      <w:pPr>
-        <w:rPr>
-          <w:lang w:val="en-IN"/>
-        </w:rPr>
-      </w:pPr>
-    </w:p>
-    <w:p>
-      <w:pPr>
-        <w:rPr>
-          <w:lang w:val="en-IN"/>
-        </w:rPr>
-      </w:pPr>
-      <w:r>
-        <w:rPr>
-          <w:lang w:val="en-IN"/>
-        </w:rPr>
+        <w:t>Decision Tree</w:t>
+      </w:r>
+    </w:p>
+    <w:p>
+      <w:pPr>
+        <w:rPr>
+          <w:lang w:val="en-IN"/>
+        </w:rPr>
+      </w:pPr>
+    </w:p>
+    <w:p>
+      <w:pPr>
+        <w:jc w:val="center"/>
+        <w:rPr>
+          <w:lang w:val="en-IN"/>
+        </w:rPr>
+      </w:pPr>
+      <w:r>
+        <w:rPr>
+          <w:lang w:val="en-IN"/>
+        </w:rPr>
+        <w:drawing>
+          <wp:inline distT="0" distB="0" distL="0" distR="0" wp14:anchorId="2C3F951C" wp14:editId="0B0AB54A">
+            <wp:extent cx="2368251" cy="2191567"/>
+            <wp:effectExtent l="0" t="0" r="0" b="0"/>
+            <wp:docPr id="2099787760" name="Picture 1"/>
+            <wp:cNvGraphicFramePr>
+              <a:graphicFrameLocks xmlns:a="http://schemas.openxmlformats.org/drawingml/2006/main" noChangeAspect="1"/>
+            </wp:cNvGraphicFramePr>
+            <a:graphic xmlns:a="http://schemas.openxmlformats.org/drawingml/2006/main">
+              <a:graphicData uri="http://schemas.openxmlformats.org/drawingml/2006/picture">
+                <pic:pic xmlns:pic="http://schemas.openxmlformats.org/drawingml/2006/picture">
+                  <pic:nvPicPr>
+                    <pic:cNvPr id="2099787760" name=""/>
+                    <pic:cNvPicPr/>
+                  </pic:nvPicPr>
+                  <pic:blipFill rotWithShape="1">
+                    <a:blip r:embed="rId7"/>
+                    <a:srcRect l="712"/>
+                    <a:stretch>
+                      <a:fillRect/>
+                    </a:stretch>
+                  </pic:blipFill>
+                  <pic:spPr bwMode="auto">
+                    <a:xfrm>
+                      <a:off x="0" y="0"/>
+                      <a:ext cx="2381657" cy="2203973"/>
+                    </a:xfrm>
+                    <a:prstGeom prst="rect">
+                      <a:avLst/>
+                    </a:prstGeom>
+                    <a:ln>
+                      <a:noFill/>
+                    </a:ln>
+                    <a:extLst>
+                      <a:ext uri="{53640926-AAD7-44D8-BBD7-CCE9431645EC}">
+                        <a14:shadowObscured xmlns:a14="http://schemas.microsoft.com/office/drawing/2010/main"/>
+                      </a:ext>
+                    </a:extLst>
+                  </pic:spPr>
+                </pic:pic>
+              </a:graphicData>
+            </a:graphic>
+          </wp:inline>
+        </w:drawing>
+      </w:r>
+      <w:r>
+        <w:rPr>
+          <w:lang w:val="en-IN"/>
+        </w:rPr>
+        <w:t xml:space="preserve">     </w:t>
+      </w:r>
+      <w:r>
+        <w:rPr>
+          <w:noProof/>
+          <w:lang w:val="en-IN"/>
+        </w:rPr>
+        <w:drawing>
+          <wp:inline distT="0" distB="0" distL="0" distR="0" wp14:anchorId="4E19183F" wp14:editId="692B5AD9">
+            <wp:extent cx="2927350" cy="1951567"/>
+            <wp:effectExtent l="0" t="0" r="6350" b="0"/>
+            <wp:docPr id="807005593" name="Picture 10"/>
+            <wp:cNvGraphicFramePr>
+              <a:graphicFrameLocks xmlns:a="http://schemas.openxmlformats.org/drawingml/2006/main" noChangeAspect="1"/>
+            </wp:cNvGraphicFramePr>
+            <a:graphic xmlns:a="http://schemas.openxmlformats.org/drawingml/2006/main">
+              <a:graphicData uri="http://schemas.openxmlformats.org/drawingml/2006/picture">
+                <pic:pic xmlns:pic="http://schemas.openxmlformats.org/drawingml/2006/picture">
+                  <pic:nvPicPr>
+                    <pic:cNvPr id="0" name="Picture 6"/>
+                    <pic:cNvPicPr>
+                      <a:picLocks noChangeAspect="1" noChangeArrowheads="1"/>
+                    </pic:cNvPicPr>
+                  </pic:nvPicPr>
+                  <pic:blipFill>
+                    <a:blip r:embed="rId8">
+                      <a:extLst>
+                        <a:ext uri="{28A0092B-C50C-407E-A947-70E740481C1C}">
+                          <a14:useLocalDpi xmlns:a14="http://schemas.microsoft.com/office/drawing/2010/main" val="0"/>
+                        </a:ext>
+                      </a:extLst>
+                    </a:blip>
+                    <a:srcRect/>
+                    <a:stretch>
+                      <a:fillRect/>
+                    </a:stretch>
+                  </pic:blipFill>
+                  <pic:spPr bwMode="auto">
+                    <a:xfrm>
+                      <a:off x="0" y="0"/>
+                      <a:ext cx="2930043" cy="1953362"/>
+                    </a:xfrm>
+                    <a:prstGeom prst="rect">
+                      <a:avLst/>
+                    </a:prstGeom>
+                    <a:noFill/>
+                  </pic:spPr>
+                </pic:pic>
+              </a:graphicData>
+            </a:graphic>
+          </wp:inline>
+        </w:drawing>
+      </w:r>
+    </w:p>
+    <w:p>
+      <w:pPr>
+        <w:jc w:val="center"/>
+        <w:rPr>
+          <w:lang w:val="en-IN"/>
+        </w:rPr>
+      </w:pPr>
+    </w:p>
+    <w:p>
+      <w:pPr>
+        <w:pStyle w:val="ListParagraph"/>
+        <w:numPr>
+          <w:ilvl w:val="0"/>
+          <w:numId w:val="8"/>
+        </w:numPr>
+        <w:rPr>
+          <w:lang w:val="en-IN"/>
+        </w:rPr>
+      </w:pPr>
+      <w:r>
+        <w:rPr>
+          <w:lang w:val="en-IN"/>
+        </w:rPr>
+        <w:t>It has a hierarchical, tree structure, which consists of a root node, branches, internal nodes and leaf nodes.</w:t>
+      </w:r>
+    </w:p>
+    <w:p>
+      <w:pPr>
+        <w:pStyle w:val="ListParagraph"/>
+        <w:numPr>
+          <w:ilvl w:val="1"/>
+          <w:numId w:val="8"/>
+        </w:numPr>
+        <w:rPr>
+          <w:lang w:val="en-IN"/>
+        </w:rPr>
+      </w:pPr>
+      <w:r>
+        <w:rPr>
+          <w:lang w:val="en-IN"/>
+        </w:rPr>
+        <w:t>Internal nodes represent attribute tests</w:t>
+      </w:r>
+    </w:p>
+    <w:p>
+      <w:pPr>
+        <w:pStyle w:val="ListParagraph"/>
+        <w:numPr>
+          <w:ilvl w:val="1"/>
+          <w:numId w:val="8"/>
+        </w:numPr>
+        <w:rPr>
+          <w:lang w:val="en-IN"/>
+        </w:rPr>
+      </w:pPr>
+      <w:r>
+        <w:rPr>
+          <w:lang w:val="en-IN"/>
+        </w:rPr>
+        <w:t>Branches represent attribute values</w:t>
+      </w:r>
+    </w:p>
+    <w:p>
+      <w:pPr>
+        <w:pStyle w:val="ListParagraph"/>
+        <w:numPr>
+          <w:ilvl w:val="1"/>
+          <w:numId w:val="8"/>
+        </w:numPr>
+        <w:rPr>
+          <w:lang w:val="en-IN"/>
+        </w:rPr>
+      </w:pPr>
+      <w:r>
+        <w:rPr>
+          <w:lang w:val="en-IN"/>
+        </w:rPr>
+        <w:t>Leaf nodes represent final decisions or predictions.</w:t>
+      </w:r>
+    </w:p>
+    <w:p>
+      <w:pPr>
+        <w:pStyle w:val="ListParagraph"/>
+        <w:numPr>
+          <w:ilvl w:val="0"/>
+          <w:numId w:val="8"/>
+        </w:numPr>
+        <w:rPr>
+          <w:lang w:val="en-IN"/>
+        </w:rPr>
+      </w:pPr>
+      <w:r>
+        <w:rPr>
+          <w:lang w:val="en-IN"/>
+        </w:rPr>
+        <w:t xml:space="preserve">A decision tree </w:t>
+      </w:r>
+      <w:r>
+        <w:rPr>
+          <w:b/>
+          <w:bCs/>
+          <w:lang w:val="en-IN"/>
+        </w:rPr>
+        <w:t>splits the dataset</w:t>
+      </w:r>
+      <w:r>
+        <w:rPr>
+          <w:lang w:val="en-IN"/>
+        </w:rPr>
+        <w:t xml:space="preserve"> based on feature values to create pure subsets ideally </w:t>
+      </w:r>
+      <w:r>
+        <w:rPr>
+          <w:b/>
+          <w:bCs/>
+          <w:lang w:val="en-IN"/>
+        </w:rPr>
+        <w:t>all items</w:t>
+      </w:r>
+      <w:r>
+        <w:rPr>
+          <w:lang w:val="en-IN"/>
+        </w:rPr>
+        <w:t xml:space="preserve"> in a group belong to the </w:t>
+      </w:r>
+      <w:r>
+        <w:rPr>
+          <w:b/>
+          <w:bCs/>
+          <w:lang w:val="en-IN"/>
+        </w:rPr>
+        <w:t>same class</w:t>
+      </w:r>
+      <w:r>
+        <w:rPr>
+          <w:lang w:val="en-IN"/>
+        </w:rPr>
+        <w:t>.</w:t>
+      </w:r>
+    </w:p>
+    <w:p>
+      <w:pPr>
+        <w:pStyle w:val="ListParagraph"/>
+        <w:numPr>
+          <w:ilvl w:val="0"/>
+          <w:numId w:val="8"/>
+        </w:numPr>
+        <w:rPr>
+          <w:lang w:val="en-IN"/>
+        </w:rPr>
+      </w:pPr>
+      <w:r>
+        <w:rPr>
+          <w:lang w:val="en-IN"/>
+        </w:rPr>
+        <w:t xml:space="preserve">Each leaf node of the tree corresponds to a class </w:t>
+      </w:r>
+      <w:proofErr w:type="gramStart"/>
+      <w:r>
+        <w:rPr>
+          <w:lang w:val="en-IN"/>
+        </w:rPr>
+        <w:t>label</w:t>
+      </w:r>
+      <w:proofErr w:type="gramEnd"/>
+      <w:r>
+        <w:rPr>
+          <w:lang w:val="en-IN"/>
+        </w:rPr>
+        <w:t xml:space="preserve"> and the internal nodes are feature-based decision points.</w:t>
+      </w:r>
+    </w:p>
+    <w:p>
+      <w:pPr>
+        <w:pStyle w:val="ListParagraph"/>
+        <w:numPr>
+          <w:ilvl w:val="0"/>
+          <w:numId w:val="8"/>
+        </w:numPr>
+        <w:rPr>
+          <w:lang w:val="en-IN"/>
+        </w:rPr>
+      </w:pPr>
+      <w:r>
+        <w:rPr>
+          <w:lang w:val="en-IN"/>
+        </w:rPr>
+        <w:t>Let’s consider a decision tree for predicting whether a customer will buy a product based on age, income and previous purchases: Here's how the decision tree works:</w:t>
+      </w:r>
+    </w:p>
+    <w:p>
+      <w:pPr>
+        <w:pStyle w:val="ListParagraph"/>
+        <w:numPr>
+          <w:ilvl w:val="0"/>
+          <w:numId w:val="8"/>
+        </w:numPr>
+        <w:rPr>
+          <w:lang w:val="en-IN"/>
+        </w:rPr>
+      </w:pPr>
+      <w:r>
+        <w:rPr>
+          <w:noProof/>
+          <w:lang w:val="en-IN"/>
+        </w:rPr>
+        <w:drawing>
+          <wp:inline distT="0" distB="0" distL="0" distR="0" wp14:anchorId="59312BFE" wp14:editId="088B91A6">
+            <wp:extent cx="5029200" cy="2514600"/>
+            <wp:effectExtent l="0" t="0" r="0" b="0"/>
+            <wp:docPr id="1764167320" name="Picture 9"/>
+            <wp:cNvGraphicFramePr>
+              <a:graphicFrameLocks xmlns:a="http://schemas.openxmlformats.org/drawingml/2006/main" noChangeAspect="1"/>
+            </wp:cNvGraphicFramePr>
+            <a:graphic xmlns:a="http://schemas.openxmlformats.org/drawingml/2006/main">
+              <a:graphicData uri="http://schemas.openxmlformats.org/drawingml/2006/picture">
+                <pic:pic xmlns:pic="http://schemas.openxmlformats.org/drawingml/2006/picture">
+                  <pic:nvPicPr>
+                    <pic:cNvPr id="0" name="Picture 5"/>
+                    <pic:cNvPicPr>
+                      <a:picLocks noChangeAspect="1" noChangeArrowheads="1"/>
+                    </pic:cNvPicPr>
+                  </pic:nvPicPr>
+                  <pic:blipFill>
+                    <a:blip r:embed="rId9">
+                      <a:extLst>
+                        <a:ext uri="{28A0092B-C50C-407E-A947-70E740481C1C}">
+                          <a14:useLocalDpi xmlns:a14="http://schemas.microsoft.com/office/drawing/2010/main" val="0"/>
+                        </a:ext>
+                      </a:extLst>
+                    </a:blip>
+                    <a:srcRect/>
+                    <a:stretch>
+                      <a:fillRect/>
+                    </a:stretch>
+                  </pic:blipFill>
+                  <pic:spPr bwMode="auto">
+                    <a:xfrm>
+                      <a:off x="0" y="0"/>
+                      <a:ext cx="5029200" cy="2514600"/>
+                    </a:xfrm>
+                    <a:prstGeom prst="rect">
+                      <a:avLst/>
+                    </a:prstGeom>
+                    <a:noFill/>
+                  </pic:spPr>
+                </pic:pic>
+              </a:graphicData>
+            </a:graphic>
+          </wp:inline>
+        </w:drawing>
+      </w:r>
+    </w:p>
+    <w:p>
+      <w:pPr>
+        <w:pStyle w:val="ListParagraph"/>
+        <w:numPr>
+          <w:ilvl w:val="0"/>
+          <w:numId w:val="8"/>
+        </w:numPr>
+        <w:jc w:val="both"/>
+        <w:rPr>
+          <w:lang w:val="en-IN"/>
+        </w:rPr>
+      </w:pPr>
+      <w:r>
+        <w:rPr>
+          <w:lang w:val="en-IN"/>
+        </w:rPr>
+        <w:lastRenderedPageBreak/>
+        <w:t>Root Node (Income)</w:t>
+      </w:r>
+    </w:p>
+    <w:p>
+      <w:pPr>
+        <w:pStyle w:val="ListParagraph"/>
+        <w:numPr>
+          <w:ilvl w:val="1"/>
+          <w:numId w:val="8"/>
+        </w:numPr>
+        <w:jc w:val="both"/>
+        <w:rPr>
+          <w:lang w:val="en-IN"/>
+        </w:rPr>
+      </w:pPr>
+      <w:r>
+        <w:rPr>
+          <w:lang w:val="en-IN"/>
+        </w:rPr>
+        <w:t>First Question: "Is the person’s income greater than $50,000?"</w:t>
+      </w:r>
+    </w:p>
+    <w:p>
+      <w:pPr>
+        <w:pStyle w:val="ListParagraph"/>
+        <w:numPr>
+          <w:ilvl w:val="2"/>
+          <w:numId w:val="8"/>
+        </w:numPr>
+        <w:jc w:val="both"/>
+        <w:rPr>
+          <w:lang w:val="en-IN"/>
+        </w:rPr>
+      </w:pPr>
+      <w:r>
+        <w:rPr>
+          <w:lang w:val="en-IN"/>
+        </w:rPr>
+        <w:t xml:space="preserve">If </w:t>
+      </w:r>
+      <w:proofErr w:type="gramStart"/>
+      <w:r>
+        <w:rPr>
+          <w:lang w:val="en-IN"/>
+        </w:rPr>
+        <w:t>Yes</w:t>
+      </w:r>
+      <w:proofErr w:type="gramEnd"/>
+      <w:r>
+        <w:rPr>
+          <w:lang w:val="en-IN"/>
+        </w:rPr>
+        <w:t>, proceed to the next question.</w:t>
+      </w:r>
+    </w:p>
+    <w:p>
+      <w:pPr>
+        <w:pStyle w:val="ListParagraph"/>
+        <w:numPr>
+          <w:ilvl w:val="2"/>
+          <w:numId w:val="8"/>
+        </w:numPr>
+        <w:jc w:val="both"/>
+        <w:rPr>
+          <w:lang w:val="en-IN"/>
+        </w:rPr>
+      </w:pPr>
+      <w:r>
+        <w:rPr>
+          <w:lang w:val="en-IN"/>
+        </w:rPr>
+        <w:t xml:space="preserve">If </w:t>
+      </w:r>
+      <w:proofErr w:type="gramStart"/>
+      <w:r>
+        <w:rPr>
+          <w:lang w:val="en-IN"/>
+        </w:rPr>
+        <w:t>No</w:t>
+      </w:r>
+      <w:proofErr w:type="gramEnd"/>
+      <w:r>
+        <w:rPr>
+          <w:lang w:val="en-IN"/>
+        </w:rPr>
+        <w:t>, predict "No Purchase" (leaf node).</w:t>
+      </w:r>
+    </w:p>
+    <w:p>
+      <w:pPr>
+        <w:pStyle w:val="ListParagraph"/>
+        <w:numPr>
+          <w:ilvl w:val="0"/>
+          <w:numId w:val="8"/>
+        </w:numPr>
+        <w:jc w:val="both"/>
+        <w:rPr>
+          <w:lang w:val="en-IN"/>
+        </w:rPr>
+      </w:pPr>
+      <w:r>
+        <w:rPr>
+          <w:lang w:val="en-IN"/>
+        </w:rPr>
+        <w:t>Internal Node (Age):</w:t>
+      </w:r>
+    </w:p>
+    <w:p>
+      <w:pPr>
+        <w:pStyle w:val="ListParagraph"/>
+        <w:numPr>
+          <w:ilvl w:val="1"/>
+          <w:numId w:val="8"/>
+        </w:numPr>
+        <w:jc w:val="both"/>
+        <w:rPr>
+          <w:lang w:val="en-IN"/>
+        </w:rPr>
+      </w:pPr>
+      <w:r>
+        <w:rPr>
+          <w:lang w:val="en-IN"/>
+        </w:rPr>
+        <w:t>If the person’s income is greater than $50,000, ask: "Is the person’s age above 30?"</w:t>
+      </w:r>
+    </w:p>
+    <w:p>
+      <w:pPr>
+        <w:pStyle w:val="ListParagraph"/>
+        <w:numPr>
+          <w:ilvl w:val="2"/>
+          <w:numId w:val="8"/>
+        </w:numPr>
+        <w:jc w:val="both"/>
+        <w:rPr>
+          <w:lang w:val="en-IN"/>
+        </w:rPr>
+      </w:pPr>
+      <w:r>
+        <w:rPr>
+          <w:lang w:val="en-IN"/>
+        </w:rPr>
+        <w:t xml:space="preserve">If </w:t>
+      </w:r>
+      <w:proofErr w:type="gramStart"/>
+      <w:r>
+        <w:rPr>
+          <w:lang w:val="en-IN"/>
+        </w:rPr>
+        <w:t>Yes</w:t>
+      </w:r>
+      <w:proofErr w:type="gramEnd"/>
+      <w:r>
+        <w:rPr>
+          <w:lang w:val="en-IN"/>
+        </w:rPr>
+        <w:t>, proceed to the next question.</w:t>
+      </w:r>
+    </w:p>
+    <w:p>
+      <w:pPr>
+        <w:pStyle w:val="ListParagraph"/>
+        <w:numPr>
+          <w:ilvl w:val="2"/>
+          <w:numId w:val="8"/>
+        </w:numPr>
+        <w:jc w:val="both"/>
+        <w:rPr>
+          <w:lang w:val="en-IN"/>
+        </w:rPr>
+      </w:pPr>
+      <w:r>
+        <w:rPr>
+          <w:lang w:val="en-IN"/>
+        </w:rPr>
+        <w:t xml:space="preserve">If </w:t>
+      </w:r>
+      <w:proofErr w:type="gramStart"/>
+      <w:r>
+        <w:rPr>
+          <w:lang w:val="en-IN"/>
+        </w:rPr>
+        <w:t>No</w:t>
+      </w:r>
+      <w:proofErr w:type="gramEnd"/>
+      <w:r>
+        <w:rPr>
+          <w:lang w:val="en-IN"/>
+        </w:rPr>
+        <w:t>, predict "No Purchase" (leaf node).</w:t>
+      </w:r>
+    </w:p>
+    <w:p>
+      <w:pPr>
+        <w:pStyle w:val="ListParagraph"/>
+        <w:numPr>
+          <w:ilvl w:val="0"/>
+          <w:numId w:val="8"/>
+        </w:numPr>
+        <w:jc w:val="both"/>
+        <w:rPr>
+          <w:lang w:val="en-IN"/>
+        </w:rPr>
+      </w:pPr>
+      <w:r>
+        <w:rPr>
+          <w:lang w:val="en-IN"/>
+        </w:rPr>
+        <w:t>Internal Node (Previous Purchases):</w:t>
+      </w:r>
+    </w:p>
+    <w:p>
+      <w:pPr>
+        <w:pStyle w:val="ListParagraph"/>
+        <w:numPr>
+          <w:ilvl w:val="1"/>
+          <w:numId w:val="8"/>
+        </w:numPr>
+        <w:jc w:val="both"/>
+        <w:rPr>
+          <w:lang w:val="en-IN"/>
+        </w:rPr>
+      </w:pPr>
+      <w:r>
+        <w:rPr>
+          <w:lang w:val="en-IN"/>
+        </w:rPr>
+        <w:t>If the person is above 30 and has made previous purchases, predict "Purchase" (leaf node).</w:t>
+      </w:r>
+    </w:p>
+    <w:p>
+      <w:pPr>
+        <w:pStyle w:val="ListParagraph"/>
+        <w:numPr>
+          <w:ilvl w:val="1"/>
+          <w:numId w:val="8"/>
+        </w:numPr>
+        <w:jc w:val="both"/>
+        <w:rPr>
+          <w:lang w:val="en-IN"/>
+        </w:rPr>
+      </w:pPr>
+      <w:r>
+        <w:rPr>
+          <w:lang w:val="en-IN"/>
+        </w:rPr>
+        <w:t>If the person is above 30 and has not made previous purchases, predict "No Purchase" (leaf node).</w:t>
+      </w:r>
+    </w:p>
+    <w:p>
+      <w:pPr>
+        <w:jc w:val="both"/>
+        <w:rPr>
+          <w:lang w:val="en-IN"/>
+        </w:rPr>
+      </w:pPr>
+    </w:p>
+    <w:p>
+      <w:pPr>
+        <w:pStyle w:val="ListParagraph"/>
+        <w:numPr>
+          <w:ilvl w:val="0"/>
+          <w:numId w:val="8"/>
+        </w:numPr>
+        <w:jc w:val="both"/>
+        <w:rPr>
+          <w:lang w:val="en-IN"/>
+        </w:rPr>
+      </w:pPr>
+      <w:r>
+        <w:rPr>
+          <w:lang w:val="en-IN"/>
+        </w:rPr>
+        <w:t>Types of Decision Trees</w:t>
+      </w:r>
+    </w:p>
+    <w:p>
+      <w:pPr>
+        <w:pStyle w:val="ListParagraph"/>
+        <w:numPr>
+          <w:ilvl w:val="1"/>
+          <w:numId w:val="8"/>
+        </w:numPr>
+        <w:jc w:val="both"/>
+        <w:rPr>
+          <w:lang w:val="en-IN"/>
+        </w:rPr>
+      </w:pPr>
+      <w:r>
+        <w:rPr>
+          <w:lang w:val="en-IN"/>
+        </w:rPr>
+        <w:t xml:space="preserve">CART (Classification and Regression Trees) → uses </w:t>
+      </w:r>
+      <w:r>
+        <w:rPr>
+          <w:b/>
+          <w:bCs/>
+          <w:lang w:val="en-IN"/>
+        </w:rPr>
+        <w:t xml:space="preserve">Gini </w:t>
+      </w:r>
+      <w:proofErr w:type="gramStart"/>
+      <w:r>
+        <w:rPr>
+          <w:b/>
+          <w:bCs/>
+          <w:lang w:val="en-IN"/>
+        </w:rPr>
+        <w:t>Index</w:t>
+      </w:r>
+      <w:r>
+        <w:rPr>
+          <w:lang w:val="en-IN"/>
+        </w:rPr>
+        <w:t>(</w:t>
+      </w:r>
+      <w:proofErr w:type="gramEnd"/>
+      <w:r>
+        <w:rPr>
+          <w:lang w:val="en-IN"/>
+        </w:rPr>
+        <w:t>Classification) as metric.</w:t>
+      </w:r>
+    </w:p>
+    <w:p>
+      <w:pPr>
+        <w:pStyle w:val="ListParagraph"/>
+        <w:numPr>
+          <w:ilvl w:val="1"/>
+          <w:numId w:val="8"/>
+        </w:numPr>
+        <w:jc w:val="both"/>
+        <w:rPr>
+          <w:lang w:val="en-IN"/>
+        </w:rPr>
+      </w:pPr>
+      <w:r>
+        <w:rPr>
+          <w:lang w:val="en-IN"/>
+        </w:rPr>
+        <w:t xml:space="preserve">ID3 (Iterative </w:t>
+      </w:r>
+      <w:proofErr w:type="spellStart"/>
+      <w:r>
+        <w:rPr>
+          <w:lang w:val="en-IN"/>
+        </w:rPr>
+        <w:t>Dichotomiser</w:t>
+      </w:r>
+      <w:proofErr w:type="spellEnd"/>
+      <w:r>
+        <w:rPr>
+          <w:lang w:val="en-IN"/>
+        </w:rPr>
+        <w:t xml:space="preserve"> 3) → uses </w:t>
+      </w:r>
+      <w:r>
+        <w:rPr>
+          <w:b/>
+          <w:bCs/>
+          <w:lang w:val="en-IN"/>
+        </w:rPr>
+        <w:t>Entropy function</w:t>
+      </w:r>
+      <w:r>
+        <w:rPr>
+          <w:lang w:val="en-IN"/>
+        </w:rPr>
+        <w:t xml:space="preserve"> and </w:t>
+      </w:r>
+      <w:r>
+        <w:rPr>
+          <w:b/>
+          <w:bCs/>
+          <w:lang w:val="en-IN"/>
+        </w:rPr>
+        <w:t>Information gain</w:t>
+      </w:r>
+      <w:r>
+        <w:rPr>
+          <w:lang w:val="en-IN"/>
+        </w:rPr>
+        <w:t xml:space="preserve"> as metrics.</w:t>
+      </w:r>
+    </w:p>
+    <w:p>
+      <w:pPr>
+        <w:pStyle w:val="ListParagraph"/>
+        <w:numPr>
+          <w:ilvl w:val="0"/>
+          <w:numId w:val="8"/>
+        </w:numPr>
+        <w:jc w:val="both"/>
+        <w:rPr>
+          <w:lang w:val="en-IN"/>
+        </w:rPr>
+      </w:pPr>
+      <w:r>
+        <w:rPr>
+          <w:lang w:val="en-IN"/>
+        </w:rPr>
+        <w:t>Terms to understand</w:t>
+      </w:r>
+    </w:p>
+    <w:p>
+      <w:pPr>
+        <w:pStyle w:val="ListParagraph"/>
+        <w:numPr>
+          <w:ilvl w:val="1"/>
+          <w:numId w:val="8"/>
+        </w:numPr>
+        <w:jc w:val="both"/>
+        <w:rPr>
+          <w:lang w:val="en-IN"/>
+        </w:rPr>
+      </w:pPr>
+      <w:r>
+        <w:rPr>
+          <w:lang w:val="en-IN"/>
+        </w:rPr>
+        <w:t>Root Nodes — It is the node present at the beginning of a decision tree from this node the population starts dividing according to various features.</w:t>
+      </w:r>
+    </w:p>
+    <w:p>
+      <w:pPr>
+        <w:pStyle w:val="ListParagraph"/>
+        <w:numPr>
+          <w:ilvl w:val="1"/>
+          <w:numId w:val="8"/>
+        </w:numPr>
+        <w:jc w:val="both"/>
+        <w:rPr>
+          <w:lang w:val="en-IN"/>
+        </w:rPr>
+      </w:pPr>
+      <w:r>
+        <w:rPr>
+          <w:lang w:val="en-IN"/>
+        </w:rPr>
+        <w:t>Decision Nodes — the nodes we get after splitting the root nodes are called Decision Node</w:t>
+      </w:r>
+    </w:p>
+    <w:p>
+      <w:pPr>
+        <w:pStyle w:val="ListParagraph"/>
+        <w:numPr>
+          <w:ilvl w:val="1"/>
+          <w:numId w:val="8"/>
+        </w:numPr>
+        <w:jc w:val="both"/>
+        <w:rPr>
+          <w:lang w:val="en-IN"/>
+        </w:rPr>
+      </w:pPr>
+      <w:r>
+        <w:rPr>
+          <w:lang w:val="en-IN"/>
+        </w:rPr>
+        <w:t>Leaf Nodes — the nodes where further splitting is not possible are called leaf nodes or terminal nodes</w:t>
+      </w:r>
+    </w:p>
+    <w:p>
+      <w:pPr>
+        <w:pStyle w:val="ListParagraph"/>
+        <w:numPr>
+          <w:ilvl w:val="1"/>
+          <w:numId w:val="8"/>
+        </w:numPr>
+        <w:jc w:val="both"/>
+        <w:rPr>
+          <w:lang w:val="en-IN"/>
+        </w:rPr>
+      </w:pPr>
+      <w:r>
+        <w:rPr>
+          <w:lang w:val="en-IN"/>
+        </w:rPr>
+        <w:t>Branch/Sub-tree — just like a small portion of a graph is called sub-graph similarly a sub-section of this decision tree is called sub-tree.</w:t>
+      </w:r>
+    </w:p>
+    <w:p>
+      <w:pPr>
+        <w:pStyle w:val="ListParagraph"/>
+        <w:numPr>
+          <w:ilvl w:val="1"/>
+          <w:numId w:val="8"/>
+        </w:numPr>
+        <w:jc w:val="both"/>
+        <w:rPr>
+          <w:lang w:val="en-IN"/>
+        </w:rPr>
+      </w:pPr>
+      <w:r>
+        <w:rPr>
+          <w:lang w:val="en-IN"/>
+        </w:rPr>
+        <w:t>Pruning — is nothing but cutting down some nodes to stop overfitting.</w:t>
+      </w:r>
+    </w:p>
+    <w:p>
+      <w:pPr>
+        <w:pStyle w:val="ListParagraph"/>
+        <w:numPr>
+          <w:ilvl w:val="0"/>
+          <w:numId w:val="8"/>
+        </w:numPr>
+        <w:jc w:val="both"/>
+        <w:rPr>
+          <w:lang w:val="en-IN"/>
+        </w:rPr>
+      </w:pPr>
+    </w:p>
+    <w:p>
+      <w:pPr>
+        <w:rPr>
+          <w:lang w:val="en-IN"/>
+        </w:rPr>
+      </w:pPr>
+    </w:p>
+    <w:p>
+      <w:pPr>
+        <w:rPr>
+          <w:lang w:val="en-IN"/>
+        </w:rPr>
+      </w:pPr>
+    </w:p>
+    <w:p>
+      <w:pPr>
+        <w:rPr>
+          <w:lang w:val="en-IN"/>
+        </w:rPr>
+      </w:pPr>
+    </w:p>
+    <w:p>
+      <w:pPr>
+        <w:rPr>
+          <w:lang w:val="en-IN"/>
+        </w:rPr>
+      </w:pPr>
+    </w:p>
+    <w:p>
+      <w:pPr>
+        <w:rPr>
+          <w:lang w:val="en-IN"/>
+        </w:rPr>
+      </w:pPr>
+      <w:r>
+        <w:rPr>
+          <w:lang w:val="en-IN"/>
+        </w:rPr>
+        <w:lastRenderedPageBreak/>
         <w:t>In each Algorithm explanation, Include below</w:t>
       </w:r>
     </w:p>
@@ -1808,6 +2727,119 @@
     </w:lvl>
   </w:abstractNum>
   <w:abstractNum w:abstractNumId="2" w15:restartNumberingAfterBreak="0">
+    <w:nsid w:val="250446D4"/>
+    <w:multiLevelType w:val="hybridMultilevel"/>
+    <w:tmpl w:val="C9B01778"/>
+    <w:lvl w:ilvl="0" w:tplc="04090005">
+      <w:start w:val="1"/>
+      <w:numFmt w:val="bullet"/>
+      <w:lvlText w:val=""/>
+      <w:lvlJc w:val="left"/>
+      <w:pPr>
+        <w:ind w:left="720" w:hanging="360"/>
+      </w:pPr>
+      <w:rPr>
+        <w:rFonts w:ascii="Wingdings" w:hAnsi="Wingdings" w:hint="default"/>
+      </w:rPr>
+    </w:lvl>
+    <w:lvl w:ilvl="1" w:tplc="04090003">
+      <w:start w:val="1"/>
+      <w:numFmt w:val="bullet"/>
+      <w:lvlText w:val="o"/>
+      <w:lvlJc w:val="left"/>
+      <w:pPr>
+        <w:ind w:left="1440" w:hanging="360"/>
+      </w:pPr>
+      <w:rPr>
+        <w:rFonts w:ascii="Courier New" w:hAnsi="Courier New" w:cs="Courier New" w:hint="default"/>
+      </w:rPr>
+    </w:lvl>
+    <w:lvl w:ilvl="2" w:tplc="04090005">
+      <w:start w:val="1"/>
+      <w:numFmt w:val="bullet"/>
+      <w:lvlText w:val=""/>
+      <w:lvlJc w:val="left"/>
+      <w:pPr>
+        <w:ind w:left="2160" w:hanging="360"/>
+      </w:pPr>
+      <w:rPr>
+        <w:rFonts w:ascii="Wingdings" w:hAnsi="Wingdings" w:hint="default"/>
+      </w:rPr>
+    </w:lvl>
+    <w:lvl w:ilvl="3" w:tplc="04090001" w:tentative="1">
+      <w:start w:val="1"/>
+      <w:numFmt w:val="bullet"/>
+      <w:lvlText w:val=""/>
+      <w:lvlJc w:val="left"/>
+      <w:pPr>
+        <w:ind w:left="2880" w:hanging="360"/>
+      </w:pPr>
+      <w:rPr>
+        <w:rFonts w:ascii="Symbol" w:hAnsi="Symbol" w:hint="default"/>
+      </w:rPr>
+    </w:lvl>
+    <w:lvl w:ilvl="4" w:tplc="04090003" w:tentative="1">
+      <w:start w:val="1"/>
+      <w:numFmt w:val="bullet"/>
+      <w:lvlText w:val="o"/>
+      <w:lvlJc w:val="left"/>
+      <w:pPr>
+        <w:ind w:left="3600" w:hanging="360"/>
+      </w:pPr>
+      <w:rPr>
+        <w:rFonts w:ascii="Courier New" w:hAnsi="Courier New" w:cs="Courier New" w:hint="default"/>
+      </w:rPr>
+    </w:lvl>
+    <w:lvl w:ilvl="5" w:tplc="04090005" w:tentative="1">
+      <w:start w:val="1"/>
+      <w:numFmt w:val="bullet"/>
+      <w:lvlText w:val=""/>
+      <w:lvlJc w:val="left"/>
+      <w:pPr>
+        <w:ind w:left="4320" w:hanging="360"/>
+      </w:pPr>
+      <w:rPr>
+        <w:rFonts w:ascii="Wingdings" w:hAnsi="Wingdings" w:hint="default"/>
+      </w:rPr>
+    </w:lvl>
+    <w:lvl w:ilvl="6" w:tplc="04090001" w:tentative="1">
+      <w:start w:val="1"/>
+      <w:numFmt w:val="bullet"/>
+      <w:lvlText w:val=""/>
+      <w:lvlJc w:val="left"/>
+      <w:pPr>
+        <w:ind w:left="5040" w:hanging="360"/>
+      </w:pPr>
+      <w:rPr>
+        <w:rFonts w:ascii="Symbol" w:hAnsi="Symbol" w:hint="default"/>
+      </w:rPr>
+    </w:lvl>
+    <w:lvl w:ilvl="7" w:tplc="04090003" w:tentative="1">
+      <w:start w:val="1"/>
+      <w:numFmt w:val="bullet"/>
+      <w:lvlText w:val="o"/>
+      <w:lvlJc w:val="left"/>
+      <w:pPr>
+        <w:ind w:left="5760" w:hanging="360"/>
+      </w:pPr>
+      <w:rPr>
+        <w:rFonts w:ascii="Courier New" w:hAnsi="Courier New" w:cs="Courier New" w:hint="default"/>
+      </w:rPr>
+    </w:lvl>
+    <w:lvl w:ilvl="8" w:tplc="04090005" w:tentative="1">
+      <w:start w:val="1"/>
+      <w:numFmt w:val="bullet"/>
+      <w:lvlText w:val=""/>
+      <w:lvlJc w:val="left"/>
+      <w:pPr>
+        <w:ind w:left="6480" w:hanging="360"/>
+      </w:pPr>
+      <w:rPr>
+        <w:rFonts w:ascii="Wingdings" w:hAnsi="Wingdings" w:hint="default"/>
+      </w:rPr>
+    </w:lvl>
+  </w:abstractNum>
+  <w:abstractNum w:abstractNumId="3" w15:restartNumberingAfterBreak="0">
     <w:nsid w:val="2D431FB3"/>
     <w:multiLevelType w:val="hybridMultilevel"/>
     <w:tmpl w:val="8D1852AC"/>
@@ -1896,7 +2928,7 @@
       </w:pPr>
     </w:lvl>
   </w:abstractNum>
-  <w:abstractNum w:abstractNumId="3" w15:restartNumberingAfterBreak="0">
+  <w:abstractNum w:abstractNumId="4" w15:restartNumberingAfterBreak="0">
     <w:nsid w:val="3A3D6B80"/>
     <w:multiLevelType w:val="hybridMultilevel"/>
     <w:tmpl w:val="B9987A56"/>
@@ -2009,7 +3041,7 @@
       </w:rPr>
     </w:lvl>
   </w:abstractNum>
-  <w:abstractNum w:abstractNumId="4" w15:restartNumberingAfterBreak="0">
+  <w:abstractNum w:abstractNumId="5" w15:restartNumberingAfterBreak="0">
     <w:nsid w:val="3D6F0CFC"/>
     <w:multiLevelType w:val="hybridMultilevel"/>
     <w:tmpl w:val="027EE98A"/>
@@ -2098,7 +3130,7 @@
       </w:pPr>
     </w:lvl>
   </w:abstractNum>
-  <w:abstractNum w:abstractNumId="5" w15:restartNumberingAfterBreak="0">
+  <w:abstractNum w:abstractNumId="6" w15:restartNumberingAfterBreak="0">
     <w:nsid w:val="641D6758"/>
     <w:multiLevelType w:val="hybridMultilevel"/>
     <w:tmpl w:val="D3EEF312"/>
@@ -2187,7 +3219,7 @@
       </w:pPr>
     </w:lvl>
   </w:abstractNum>
-  <w:abstractNum w:abstractNumId="6" w15:restartNumberingAfterBreak="0">
+  <w:abstractNum w:abstractNumId="7" w15:restartNumberingAfterBreak="0">
     <w:nsid w:val="7E3A3C26"/>
     <w:multiLevelType w:val="hybridMultilevel"/>
     <w:tmpl w:val="7178A20C"/>
@@ -2280,22 +3312,25 @@
     <w:abstractNumId w:val="1"/>
   </w:num>
   <w:num w:numId="2" w16cid:durableId="94138670">
+    <w:abstractNumId w:val="7"/>
+  </w:num>
+  <w:num w:numId="3" w16cid:durableId="2042975543">
     <w:abstractNumId w:val="6"/>
   </w:num>
-  <w:num w:numId="3" w16cid:durableId="2042975543">
-    <w:abstractNumId w:val="5"/>
-  </w:num>
   <w:num w:numId="4" w16cid:durableId="1088235634">
-    <w:abstractNumId w:val="2"/>
+    <w:abstractNumId w:val="3"/>
   </w:num>
   <w:num w:numId="5" w16cid:durableId="131412574">
-    <w:abstractNumId w:val="4"/>
+    <w:abstractNumId w:val="5"/>
   </w:num>
   <w:num w:numId="6" w16cid:durableId="1873876666">
     <w:abstractNumId w:val="0"/>
   </w:num>
   <w:num w:numId="7" w16cid:durableId="1547526091">
-    <w:abstractNumId w:val="3"/>
+    <w:abstractNumId w:val="4"/>
+  </w:num>
+  <w:num w:numId="8" w16cid:durableId="290746115">
+    <w:abstractNumId w:val="2"/>
   </w:num>
 </w:numbering>
 </file>

</xml_diff>

<commit_message>
Started with Unsupervised Learning in ML
</commit_message>
<xml_diff>
--- a/Machine Learning (ML)/Machine Learning Theory.docx
+++ b/Machine Learning (ML)/Machine Learning Theory.docx
@@ -302,13 +302,7 @@
         <w:rPr>
           <w:lang w:val="en-IN"/>
         </w:rPr>
-        <w:t>Ridge Regression</w:t>
-      </w:r>
-      <w:r>
-        <w:rPr>
-          <w:lang w:val="en-IN"/>
-        </w:rPr>
-        <w:t xml:space="preserve"> (L2 - Regularized version)</w:t>
+        <w:t>Ridge Regression (L2 - Regularized version)</w:t>
       </w:r>
     </w:p>
     <w:p>
@@ -326,31 +320,7 @@
         <w:rPr>
           <w:lang w:val="en-IN"/>
         </w:rPr>
-        <w:t>Lasso Regression</w:t>
-      </w:r>
-      <w:r>
-        <w:rPr>
-          <w:lang w:val="en-IN"/>
-        </w:rPr>
-        <w:t xml:space="preserve"> </w:t>
-      </w:r>
-      <w:r>
-        <w:rPr>
-          <w:lang w:val="en-IN"/>
-        </w:rPr>
-        <w:t>(</w:t>
-      </w:r>
-      <w:r>
-        <w:rPr>
-          <w:lang w:val="en-IN"/>
-        </w:rPr>
-        <w:t xml:space="preserve">L1 - </w:t>
-      </w:r>
-      <w:r>
-        <w:rPr>
-          <w:lang w:val="en-IN"/>
-        </w:rPr>
-        <w:t>Regularized version)</w:t>
+        <w:t>Lasso Regression (L1 - Regularized version)</w:t>
       </w:r>
     </w:p>
     <w:p>
@@ -727,13 +697,7 @@
         <w:rPr>
           <w:lang w:val="en-IN"/>
         </w:rPr>
-        <w:t xml:space="preserve">Neural Networks </w:t>
-      </w:r>
-      <w:r>
-        <w:rPr>
-          <w:lang w:val="en-IN"/>
-        </w:rPr>
-        <w:t>(All for Classification and Regression)</w:t>
+        <w:t>Neural Networks (All for Classification and Regression)</w:t>
       </w:r>
     </w:p>
     <w:p>
@@ -943,15 +907,7 @@
           <w:bCs/>
           <w:lang w:val="en-IN"/>
         </w:rPr>
-        <w:t>relationship between variables.</w:t>
-      </w:r>
-      <w:r>
-        <w:rPr>
-          <w:b/>
-          <w:bCs/>
-          <w:lang w:val="en-IN"/>
-        </w:rPr>
-        <w:t xml:space="preserve"> </w:t>
+        <w:t xml:space="preserve">relationship between variables. </w:t>
       </w:r>
       <w:r>
         <w:rPr>
@@ -979,19 +935,7 @@
         <w:rPr>
           <w:lang w:val="en-IN"/>
         </w:rPr>
-        <w:t xml:space="preserve">In Machine Learning and in statistical </w:t>
-      </w:r>
-      <w:r>
-        <w:rPr>
-          <w:lang w:val="en-IN"/>
-        </w:rPr>
-        <w:t>modelling</w:t>
-      </w:r>
-      <w:r>
-        <w:rPr>
-          <w:lang w:val="en-IN"/>
-        </w:rPr>
-        <w:t>, that relationship is used to predict the outcome of events.</w:t>
+        <w:t>In Machine Learning and in statistical modelling, that relationship is used to predict the outcome of events.</w:t>
       </w:r>
     </w:p>
     <w:p>
@@ -1546,6 +1490,7 @@
       </w:pPr>
       <w:r>
         <w:rPr>
+          <w:noProof/>
           <w:lang w:val="en-IN"/>
         </w:rPr>
         <w:drawing>
@@ -2464,6 +2409,7 @@
     </w:p>
     <w:p>
       <w:pPr>
+        <w:pStyle w:val="Heading1"/>
         <w:rPr>
           <w:lang w:val="en-IN"/>
         </w:rPr>
@@ -2473,6 +2419,315 @@
           <w:lang w:val="en-IN"/>
         </w:rPr>
         <w:lastRenderedPageBreak/>
+        <w:t>Unsupervised Machine Learning</w:t>
+      </w:r>
+    </w:p>
+    <w:p>
+      <w:pPr>
+        <w:rPr>
+          <w:lang w:val="en-IN"/>
+        </w:rPr>
+      </w:pPr>
+    </w:p>
+    <w:p>
+      <w:pPr>
+        <w:pStyle w:val="ListParagraph"/>
+        <w:numPr>
+          <w:ilvl w:val="0"/>
+          <w:numId w:val="9"/>
+        </w:numPr>
+        <w:rPr>
+          <w:b/>
+          <w:bCs/>
+          <w:lang w:val="en-IN"/>
+        </w:rPr>
+      </w:pPr>
+      <w:r>
+        <w:rPr>
+          <w:b/>
+          <w:bCs/>
+          <w:lang w:val="en-IN"/>
+        </w:rPr>
+        <w:t>Clustering</w:t>
+      </w:r>
+    </w:p>
+    <w:p>
+      <w:pPr>
+        <w:pStyle w:val="ListParagraph"/>
+        <w:ind w:left="993"/>
+        <w:rPr>
+          <w:sz w:val="22"/>
+          <w:szCs w:val="22"/>
+          <w:lang w:val="en-IN"/>
+        </w:rPr>
+      </w:pPr>
+      <w:r>
+        <w:rPr>
+          <w:sz w:val="22"/>
+          <w:szCs w:val="22"/>
+          <w:lang w:val="en-IN"/>
+        </w:rPr>
+        <w:t xml:space="preserve">The goal is to </w:t>
+      </w:r>
+      <w:r>
+        <w:rPr>
+          <w:sz w:val="22"/>
+          <w:szCs w:val="22"/>
+          <w:highlight w:val="yellow"/>
+          <w:lang w:val="en-IN"/>
+        </w:rPr>
+        <w:t>group similar instances</w:t>
+      </w:r>
+      <w:r>
+        <w:rPr>
+          <w:sz w:val="22"/>
+          <w:szCs w:val="22"/>
+          <w:lang w:val="en-IN"/>
+        </w:rPr>
+        <w:t xml:space="preserve"> together into clusters. Clustering is a great</w:t>
+      </w:r>
+      <w:r>
+        <w:rPr>
+          <w:sz w:val="22"/>
+          <w:szCs w:val="22"/>
+          <w:lang w:val="en-IN"/>
+        </w:rPr>
+        <w:t xml:space="preserve"> </w:t>
+      </w:r>
+      <w:r>
+        <w:rPr>
+          <w:sz w:val="22"/>
+          <w:szCs w:val="22"/>
+          <w:lang w:val="en-IN"/>
+        </w:rPr>
+        <w:t>tool for data analysis, customer segmentation, recommender systems, search</w:t>
+      </w:r>
+      <w:r>
+        <w:rPr>
+          <w:sz w:val="22"/>
+          <w:szCs w:val="22"/>
+          <w:lang w:val="en-IN"/>
+        </w:rPr>
+        <w:t xml:space="preserve"> </w:t>
+      </w:r>
+      <w:r>
+        <w:rPr>
+          <w:sz w:val="22"/>
+          <w:szCs w:val="22"/>
+          <w:lang w:val="en-IN"/>
+        </w:rPr>
+        <w:t>engines, image segmentation, semi-supervised learning, dimensionality reduction, and more.</w:t>
+      </w:r>
+    </w:p>
+    <w:p>
+      <w:pPr>
+        <w:pStyle w:val="ListParagraph"/>
+        <w:numPr>
+          <w:ilvl w:val="0"/>
+          <w:numId w:val="9"/>
+        </w:numPr>
+        <w:rPr>
+          <w:b/>
+          <w:bCs/>
+          <w:lang w:val="en-IN"/>
+        </w:rPr>
+      </w:pPr>
+      <w:r>
+        <w:rPr>
+          <w:b/>
+          <w:bCs/>
+          <w:lang w:val="en-IN"/>
+        </w:rPr>
+        <w:t>Anomaly detection</w:t>
+      </w:r>
+    </w:p>
+    <w:p>
+      <w:pPr>
+        <w:pStyle w:val="ListParagraph"/>
+        <w:ind w:left="993"/>
+        <w:rPr>
+          <w:sz w:val="22"/>
+          <w:szCs w:val="22"/>
+          <w:lang w:val="en-IN"/>
+        </w:rPr>
+      </w:pPr>
+      <w:r>
+        <w:rPr>
+          <w:sz w:val="22"/>
+          <w:szCs w:val="22"/>
+          <w:lang w:val="en-IN"/>
+        </w:rPr>
+        <w:t>The objective is to learn what “normal” data looks like, and then use that to</w:t>
+      </w:r>
+      <w:r>
+        <w:rPr>
+          <w:sz w:val="22"/>
+          <w:szCs w:val="22"/>
+          <w:lang w:val="en-IN"/>
+        </w:rPr>
+        <w:t xml:space="preserve"> </w:t>
+      </w:r>
+      <w:r>
+        <w:rPr>
+          <w:sz w:val="22"/>
+          <w:szCs w:val="22"/>
+          <w:lang w:val="en-IN"/>
+        </w:rPr>
+        <w:t>detect abnormal instances, such as defective items on a production line or a new</w:t>
+      </w:r>
+      <w:r>
+        <w:rPr>
+          <w:sz w:val="22"/>
+          <w:szCs w:val="22"/>
+          <w:lang w:val="en-IN"/>
+        </w:rPr>
+        <w:t xml:space="preserve"> </w:t>
+      </w:r>
+      <w:r>
+        <w:rPr>
+          <w:sz w:val="22"/>
+          <w:szCs w:val="22"/>
+          <w:lang w:val="en-IN"/>
+        </w:rPr>
+        <w:t>trend in a time</w:t>
+      </w:r>
+      <w:r>
+        <w:rPr>
+          <w:sz w:val="22"/>
+          <w:szCs w:val="22"/>
+          <w:lang w:val="en-IN"/>
+        </w:rPr>
+        <w:t xml:space="preserve"> </w:t>
+      </w:r>
+      <w:r>
+        <w:rPr>
+          <w:sz w:val="22"/>
+          <w:szCs w:val="22"/>
+          <w:lang w:val="en-IN"/>
+        </w:rPr>
+        <w:t>series.</w:t>
+      </w:r>
+    </w:p>
+    <w:p>
+      <w:pPr>
+        <w:pStyle w:val="ListParagraph"/>
+        <w:numPr>
+          <w:ilvl w:val="0"/>
+          <w:numId w:val="9"/>
+        </w:numPr>
+        <w:rPr>
+          <w:b/>
+          <w:bCs/>
+          <w:lang w:val="en-IN"/>
+        </w:rPr>
+      </w:pPr>
+      <w:r>
+        <w:rPr>
+          <w:b/>
+          <w:bCs/>
+          <w:lang w:val="en-IN"/>
+        </w:rPr>
+        <w:t>Density estimation</w:t>
+      </w:r>
+    </w:p>
+    <w:p>
+      <w:pPr>
+        <w:pStyle w:val="ListParagraph"/>
+        <w:ind w:left="993"/>
+        <w:rPr>
+          <w:sz w:val="22"/>
+          <w:szCs w:val="22"/>
+          <w:lang w:val="en-IN"/>
+        </w:rPr>
+      </w:pPr>
+      <w:r>
+        <w:rPr>
+          <w:sz w:val="22"/>
+          <w:szCs w:val="22"/>
+          <w:lang w:val="en-IN"/>
+        </w:rPr>
+        <w:t>This is the task of estimating the probability density function (PDF) of the random</w:t>
+      </w:r>
+      <w:r>
+        <w:rPr>
+          <w:sz w:val="22"/>
+          <w:szCs w:val="22"/>
+          <w:lang w:val="en-IN"/>
+        </w:rPr>
+        <w:t xml:space="preserve"> </w:t>
+      </w:r>
+      <w:r>
+        <w:rPr>
+          <w:sz w:val="22"/>
+          <w:szCs w:val="22"/>
+          <w:lang w:val="en-IN"/>
+        </w:rPr>
+        <w:t>process that generated the dataset. Density estimation is commonly used for</w:t>
+      </w:r>
+      <w:r>
+        <w:rPr>
+          <w:sz w:val="22"/>
+          <w:szCs w:val="22"/>
+          <w:lang w:val="en-IN"/>
+        </w:rPr>
+        <w:t xml:space="preserve"> </w:t>
+      </w:r>
+      <w:r>
+        <w:rPr>
+          <w:sz w:val="22"/>
+          <w:szCs w:val="22"/>
+          <w:lang w:val="en-IN"/>
+        </w:rPr>
+        <w:t>anomaly detection: instances located in very low-density regions are likely to be</w:t>
+      </w:r>
+      <w:r>
+        <w:rPr>
+          <w:sz w:val="22"/>
+          <w:szCs w:val="22"/>
+          <w:lang w:val="en-IN"/>
+        </w:rPr>
+        <w:t xml:space="preserve"> </w:t>
+      </w:r>
+      <w:r>
+        <w:rPr>
+          <w:sz w:val="22"/>
+          <w:szCs w:val="22"/>
+          <w:lang w:val="en-IN"/>
+        </w:rPr>
+        <w:t>anomalies. It is also useful for data analysis and visualization.</w:t>
+      </w:r>
+    </w:p>
+    <w:p>
+      <w:pPr>
+        <w:rPr>
+          <w:lang w:val="en-IN"/>
+        </w:rPr>
+      </w:pPr>
+    </w:p>
+    <w:p>
+      <w:pPr>
+        <w:rPr>
+          <w:lang w:val="en-IN"/>
+        </w:rPr>
+      </w:pPr>
+    </w:p>
+    <w:p>
+      <w:pPr>
+        <w:rPr>
+          <w:lang w:val="en-IN"/>
+        </w:rPr>
+      </w:pPr>
+    </w:p>
+    <w:p>
+      <w:pPr>
+        <w:rPr>
+          <w:lang w:val="en-IN"/>
+        </w:rPr>
+      </w:pPr>
+      <w:r>
+        <w:rPr>
+          <w:lang w:val="en-IN"/>
+        </w:rPr>
         <w:t>In each Algorithm explanation, Include below</w:t>
       </w:r>
     </w:p>
@@ -3131,6 +3386,119 @@
     </w:lvl>
   </w:abstractNum>
   <w:abstractNum w:abstractNumId="6" w15:restartNumberingAfterBreak="0">
+    <w:nsid w:val="407C10BB"/>
+    <w:multiLevelType w:val="hybridMultilevel"/>
+    <w:tmpl w:val="1970626E"/>
+    <w:lvl w:ilvl="0" w:tplc="04090005">
+      <w:start w:val="1"/>
+      <w:numFmt w:val="bullet"/>
+      <w:lvlText w:val=""/>
+      <w:lvlJc w:val="left"/>
+      <w:pPr>
+        <w:ind w:left="720" w:hanging="360"/>
+      </w:pPr>
+      <w:rPr>
+        <w:rFonts w:ascii="Wingdings" w:hAnsi="Wingdings" w:hint="default"/>
+      </w:rPr>
+    </w:lvl>
+    <w:lvl w:ilvl="1" w:tplc="04090003" w:tentative="1">
+      <w:start w:val="1"/>
+      <w:numFmt w:val="bullet"/>
+      <w:lvlText w:val="o"/>
+      <w:lvlJc w:val="left"/>
+      <w:pPr>
+        <w:ind w:left="1440" w:hanging="360"/>
+      </w:pPr>
+      <w:rPr>
+        <w:rFonts w:ascii="Courier New" w:hAnsi="Courier New" w:cs="Courier New" w:hint="default"/>
+      </w:rPr>
+    </w:lvl>
+    <w:lvl w:ilvl="2" w:tplc="04090005" w:tentative="1">
+      <w:start w:val="1"/>
+      <w:numFmt w:val="bullet"/>
+      <w:lvlText w:val=""/>
+      <w:lvlJc w:val="left"/>
+      <w:pPr>
+        <w:ind w:left="2160" w:hanging="360"/>
+      </w:pPr>
+      <w:rPr>
+        <w:rFonts w:ascii="Wingdings" w:hAnsi="Wingdings" w:hint="default"/>
+      </w:rPr>
+    </w:lvl>
+    <w:lvl w:ilvl="3" w:tplc="04090001" w:tentative="1">
+      <w:start w:val="1"/>
+      <w:numFmt w:val="bullet"/>
+      <w:lvlText w:val=""/>
+      <w:lvlJc w:val="left"/>
+      <w:pPr>
+        <w:ind w:left="2880" w:hanging="360"/>
+      </w:pPr>
+      <w:rPr>
+        <w:rFonts w:ascii="Symbol" w:hAnsi="Symbol" w:hint="default"/>
+      </w:rPr>
+    </w:lvl>
+    <w:lvl w:ilvl="4" w:tplc="04090003" w:tentative="1">
+      <w:start w:val="1"/>
+      <w:numFmt w:val="bullet"/>
+      <w:lvlText w:val="o"/>
+      <w:lvlJc w:val="left"/>
+      <w:pPr>
+        <w:ind w:left="3600" w:hanging="360"/>
+      </w:pPr>
+      <w:rPr>
+        <w:rFonts w:ascii="Courier New" w:hAnsi="Courier New" w:cs="Courier New" w:hint="default"/>
+      </w:rPr>
+    </w:lvl>
+    <w:lvl w:ilvl="5" w:tplc="04090005" w:tentative="1">
+      <w:start w:val="1"/>
+      <w:numFmt w:val="bullet"/>
+      <w:lvlText w:val=""/>
+      <w:lvlJc w:val="left"/>
+      <w:pPr>
+        <w:ind w:left="4320" w:hanging="360"/>
+      </w:pPr>
+      <w:rPr>
+        <w:rFonts w:ascii="Wingdings" w:hAnsi="Wingdings" w:hint="default"/>
+      </w:rPr>
+    </w:lvl>
+    <w:lvl w:ilvl="6" w:tplc="04090001" w:tentative="1">
+      <w:start w:val="1"/>
+      <w:numFmt w:val="bullet"/>
+      <w:lvlText w:val=""/>
+      <w:lvlJc w:val="left"/>
+      <w:pPr>
+        <w:ind w:left="5040" w:hanging="360"/>
+      </w:pPr>
+      <w:rPr>
+        <w:rFonts w:ascii="Symbol" w:hAnsi="Symbol" w:hint="default"/>
+      </w:rPr>
+    </w:lvl>
+    <w:lvl w:ilvl="7" w:tplc="04090003" w:tentative="1">
+      <w:start w:val="1"/>
+      <w:numFmt w:val="bullet"/>
+      <w:lvlText w:val="o"/>
+      <w:lvlJc w:val="left"/>
+      <w:pPr>
+        <w:ind w:left="5760" w:hanging="360"/>
+      </w:pPr>
+      <w:rPr>
+        <w:rFonts w:ascii="Courier New" w:hAnsi="Courier New" w:cs="Courier New" w:hint="default"/>
+      </w:rPr>
+    </w:lvl>
+    <w:lvl w:ilvl="8" w:tplc="04090005" w:tentative="1">
+      <w:start w:val="1"/>
+      <w:numFmt w:val="bullet"/>
+      <w:lvlText w:val=""/>
+      <w:lvlJc w:val="left"/>
+      <w:pPr>
+        <w:ind w:left="6480" w:hanging="360"/>
+      </w:pPr>
+      <w:rPr>
+        <w:rFonts w:ascii="Wingdings" w:hAnsi="Wingdings" w:hint="default"/>
+      </w:rPr>
+    </w:lvl>
+  </w:abstractNum>
+  <w:abstractNum w:abstractNumId="7" w15:restartNumberingAfterBreak="0">
     <w:nsid w:val="641D6758"/>
     <w:multiLevelType w:val="hybridMultilevel"/>
     <w:tmpl w:val="D3EEF312"/>
@@ -3219,7 +3587,7 @@
       </w:pPr>
     </w:lvl>
   </w:abstractNum>
-  <w:abstractNum w:abstractNumId="7" w15:restartNumberingAfterBreak="0">
+  <w:abstractNum w:abstractNumId="8" w15:restartNumberingAfterBreak="0">
     <w:nsid w:val="7E3A3C26"/>
     <w:multiLevelType w:val="hybridMultilevel"/>
     <w:tmpl w:val="7178A20C"/>
@@ -3312,10 +3680,10 @@
     <w:abstractNumId w:val="1"/>
   </w:num>
   <w:num w:numId="2" w16cid:durableId="94138670">
-    <w:abstractNumId w:val="7"/>
+    <w:abstractNumId w:val="8"/>
   </w:num>
   <w:num w:numId="3" w16cid:durableId="2042975543">
-    <w:abstractNumId w:val="6"/>
+    <w:abstractNumId w:val="7"/>
   </w:num>
   <w:num w:numId="4" w16cid:durableId="1088235634">
     <w:abstractNumId w:val="3"/>
@@ -3331,6 +3699,9 @@
   </w:num>
   <w:num w:numId="8" w16cid:durableId="290746115">
     <w:abstractNumId w:val="2"/>
+  </w:num>
+  <w:num w:numId="9" w16cid:durableId="1604999759">
+    <w:abstractNumId w:val="6"/>
   </w:num>
 </w:numbering>
 </file>

</xml_diff>